<commit_message>
docs: keep only revised contest doc
</commit_message>
<xml_diff>
--- a/docs/项目说明_参赛资料.docx
+++ b/docs/项目说明_参赛资料.docx
@@ -140,6 +140,17 @@
           <w:sz w:val="22"/>
         </w:rPr>
         <w:t>可视化输入把复杂拆单计算变成低门槛操作</w:t>
+      </w:r>
+    </w:p>
+    <w:p>
+      <w:pPr>
+        <w:pStyle w:val="ListBullet"/>
+      </w:pPr>
+      <w:r>
+        <w:rPr>
+          <w:sz w:val="22"/>
+        </w:rPr>
+        <w:t>让普通用户也能使用机构/量化团队常用的策略（分层建仓、分层止盈、恒定混合再平衡），不需要写代码也能上手</w:t>
       </w:r>
     </w:p>
     <w:p>

</xml_diff>